<commit_message>
feat: add objective editing functionality and update project documentation
</commit_message>
<xml_diff>
--- a/docs/documento_levantamento_requisitos.docx
+++ b/docs/documento_levantamento_requisitos.docx
@@ -1,6 +1,6 @@
 
 <file path=word/document.xml><?xml version="1.0" encoding="utf-8"?>
-<w:document xmlns:wpc="http://schemas.microsoft.com/office/word/2010/wordprocessingCanvas" xmlns:cx="http://schemas.microsoft.com/office/drawing/2014/chartex" xmlns:cx1="http://schemas.microsoft.com/office/drawing/2015/9/8/chartex" xmlns:cx2="http://schemas.microsoft.com/office/drawing/2015/10/21/chartex" xmlns:cx3="http://schemas.microsoft.com/office/drawing/2016/5/9/chartex" xmlns:cx4="http://schemas.microsoft.com/office/drawing/2016/5/10/chartex" xmlns:cx5="http://schemas.microsoft.com/office/drawing/2016/5/11/chartex" xmlns:cx6="http://schemas.microsoft.com/office/drawing/2016/5/12/chartex" xmlns:cx7="http://schemas.microsoft.com/office/drawing/2016/5/13/chartex" xmlns:cx8="http://schemas.microsoft.com/office/drawing/2016/5/14/chartex" xmlns:mc="http://schemas.openxmlformats.org/markup-compatibility/2006" xmlns:aink="http://schemas.microsoft.com/office/drawing/2016/ink" xmlns:am3d="http://schemas.microsoft.com/office/drawing/2017/model3d" xmlns:o="urn:schemas-microsoft-com:office:office" xmlns:r="http://schemas.openxmlformats.org/officeDocument/2006/relationships" xmlns:m="http://schemas.openxmlformats.org/officeDocument/2006/math" xmlns:v="urn:schemas-microsoft-com:vml" xmlns:wp14="http://schemas.microsoft.com/office/word/2010/wordprocessingDrawing" xmlns:wp="http://schemas.openxmlformats.org/drawingml/2006/wordprocessingDrawing" xmlns:w10="urn:schemas-microsoft-com:office:word" xmlns:w="http://schemas.openxmlformats.org/wordprocessingml/2006/main" xmlns:w14="http://schemas.microsoft.com/office/word/2010/wordml" xmlns:w15="http://schemas.microsoft.com/office/word/2012/wordml" xmlns:w16cex="http://schemas.microsoft.com/office/word/2018/wordml/cex" xmlns:w16cid="http://schemas.microsoft.com/office/word/2016/wordml/cid" xmlns:w16="http://schemas.microsoft.com/office/word/2018/wordml" xmlns:w16sdtdh="http://schemas.microsoft.com/office/word/2020/wordml/sdtdatahash" xmlns:w16se="http://schemas.microsoft.com/office/word/2015/wordml/symex" xmlns:wpg="http://schemas.microsoft.com/office/word/2010/wordprocessingGroup" xmlns:wpi="http://schemas.microsoft.com/office/word/2010/wordprocessingInk" xmlns:wne="http://schemas.microsoft.com/office/word/2006/wordml" xmlns:wps="http://schemas.microsoft.com/office/word/2010/wordprocessingShape" mc:Ignorable="w14 w15 w16se w16cid w16 w16cex w16sdtdh wp14">
+<w:document xmlns:wpc="http://schemas.microsoft.com/office/word/2010/wordprocessingCanvas" xmlns:cx="http://schemas.microsoft.com/office/drawing/2014/chartex" xmlns:cx1="http://schemas.microsoft.com/office/drawing/2015/9/8/chartex" xmlns:cx2="http://schemas.microsoft.com/office/drawing/2015/10/21/chartex" xmlns:cx3="http://schemas.microsoft.com/office/drawing/2016/5/9/chartex" xmlns:cx4="http://schemas.microsoft.com/office/drawing/2016/5/10/chartex" xmlns:cx5="http://schemas.microsoft.com/office/drawing/2016/5/11/chartex" xmlns:cx6="http://schemas.microsoft.com/office/drawing/2016/5/12/chartex" xmlns:cx7="http://schemas.microsoft.com/office/drawing/2016/5/13/chartex" xmlns:cx8="http://schemas.microsoft.com/office/drawing/2016/5/14/chartex" xmlns:mc="http://schemas.openxmlformats.org/markup-compatibility/2006" xmlns:aink="http://schemas.microsoft.com/office/drawing/2016/ink" xmlns:am3d="http://schemas.microsoft.com/office/drawing/2017/model3d" xmlns:o="urn:schemas-microsoft-com:office:office" xmlns:oel="http://schemas.microsoft.com/office/2019/extlst" xmlns:r="http://schemas.openxmlformats.org/officeDocument/2006/relationships" xmlns:m="http://schemas.openxmlformats.org/officeDocument/2006/math" xmlns:v="urn:schemas-microsoft-com:vml" xmlns:wp14="http://schemas.microsoft.com/office/word/2010/wordprocessingDrawing" xmlns:wp="http://schemas.openxmlformats.org/drawingml/2006/wordprocessingDrawing" xmlns:w10="urn:schemas-microsoft-com:office:word" xmlns:w="http://schemas.openxmlformats.org/wordprocessingml/2006/main" xmlns:w14="http://schemas.microsoft.com/office/word/2010/wordml" xmlns:w15="http://schemas.microsoft.com/office/word/2012/wordml" xmlns:w16cex="http://schemas.microsoft.com/office/word/2018/wordml/cex" xmlns:w16cid="http://schemas.microsoft.com/office/word/2016/wordml/cid" xmlns:w16="http://schemas.microsoft.com/office/word/2018/wordml" xmlns:w16du="http://schemas.microsoft.com/office/word/2023/wordml/word16du" xmlns:w16sdtdh="http://schemas.microsoft.com/office/word/2020/wordml/sdtdatahash" xmlns:w16sdtfl="http://schemas.microsoft.com/office/word/2024/wordml/sdtformatlock" xmlns:w16se="http://schemas.microsoft.com/office/word/2015/wordml/symex" xmlns:wpg="http://schemas.microsoft.com/office/word/2010/wordprocessingGroup" xmlns:wpi="http://schemas.microsoft.com/office/word/2010/wordprocessingInk" xmlns:wne="http://schemas.microsoft.com/office/word/2006/wordml" xmlns:wps="http://schemas.microsoft.com/office/word/2010/wordprocessingShape" mc:Ignorable="w14 w15 w16se w16cid w16 w16cex w16sdtdh w16sdtfl w16du wp14">
   <w:body>
     <w:p>
       <w:pPr>
@@ -52,7 +52,7 @@
     </w:p>
     <w:p>
       <w:pPr>
-        <w:pStyle w:val="Ttulo1"/>
+        <w:pStyle w:val="Heading1"/>
         <w:ind w:left="65"/>
       </w:pPr>
       <w:r>
@@ -120,15 +120,12 @@
     </w:p>
     <w:p>
       <w:pPr>
-        <w:pStyle w:val="Ttulo1"/>
+        <w:pStyle w:val="Heading1"/>
         <w:spacing w:after="0"/>
         <w:ind w:left="65"/>
       </w:pPr>
       <w:r>
-        <w:t xml:space="preserve">2. </w:t>
-      </w:r>
-      <w:r>
-        <w:t xml:space="preserve">Objetivos Técnicos </w:t>
+        <w:t xml:space="preserve">2. Objetivos Técnicos </w:t>
       </w:r>
     </w:p>
     <w:p>
@@ -151,7 +148,6 @@
         <w:tblCellMar>
           <w:top w:w="112" w:type="dxa"/>
           <w:left w:w="127" w:type="dxa"/>
-          <w:bottom w:w="0" w:type="dxa"/>
           <w:right w:w="115" w:type="dxa"/>
         </w:tblCellMar>
         <w:tblLook w:val="04A0" w:firstRow="1" w:lastRow="0" w:firstColumn="1" w:lastColumn="0" w:noHBand="0" w:noVBand="1"/>
@@ -559,22 +555,7 @@
         <w:ind w:left="65"/>
       </w:pPr>
       <w:r>
-        <w:t xml:space="preserve">Aplicar arquitetura </w:t>
-      </w:r>
-      <w:r>
-        <w:t>de</w:t>
-      </w:r>
-      <w:r>
-        <w:t xml:space="preserve">. </w:t>
-      </w:r>
-    </w:p>
-    <w:p>
-      <w:pPr>
-        <w:spacing w:after="9" w:line="259" w:lineRule="auto"/>
-        <w:ind w:left="0" w:firstLine="0"/>
-      </w:pPr>
-      <w:r>
-        <w:t xml:space="preserve"> </w:t>
+        <w:t>Arquitetura MVC</w:t>
       </w:r>
     </w:p>
     <w:p>
@@ -603,11 +584,105 @@
       <w:pPr>
         <w:spacing w:after="206" w:line="259" w:lineRule="auto"/>
         <w:ind w:left="0" w:firstLine="0"/>
-      </w:pPr>
-      <w:r>
         <w:rPr>
           <w:b/>
           <w:sz w:val="28"/>
+        </w:rPr>
+      </w:pPr>
+      <w:r>
+        <w:rPr>
+          <w:b/>
+          <w:sz w:val="28"/>
+        </w:rPr>
+        <w:t xml:space="preserve"> </w:t>
+      </w:r>
+    </w:p>
+    <w:p>
+      <w:pPr>
+        <w:spacing w:after="206" w:line="259" w:lineRule="auto"/>
+        <w:ind w:left="0" w:firstLine="0"/>
+        <w:rPr>
+          <w:bCs/>
+          <w:lang w:val="en-US"/>
+        </w:rPr>
+      </w:pPr>
+      <w:r>
+        <w:rPr>
+          <w:bCs/>
+          <w:sz w:val="28"/>
+          <w:lang w:val="en-US"/>
+        </w:rPr>
+        <w:t xml:space="preserve">Flask, </w:t>
+      </w:r>
+      <w:proofErr w:type="spellStart"/>
+      <w:r>
+        <w:rPr>
+          <w:bCs/>
+          <w:sz w:val="28"/>
+          <w:lang w:val="en-US"/>
+        </w:rPr>
+        <w:t>FastAPI</w:t>
+      </w:r>
+      <w:proofErr w:type="spellEnd"/>
+      <w:r>
+        <w:rPr>
+          <w:bCs/>
+          <w:sz w:val="28"/>
+          <w:lang w:val="en-US"/>
+        </w:rPr>
+        <w:t xml:space="preserve">, </w:t>
+      </w:r>
+      <w:proofErr w:type="spellStart"/>
+      <w:r>
+        <w:rPr>
+          <w:bCs/>
+          <w:sz w:val="28"/>
+          <w:lang w:val="en-US"/>
+        </w:rPr>
+        <w:t>NeonDB</w:t>
+      </w:r>
+      <w:proofErr w:type="spellEnd"/>
+      <w:r>
+        <w:rPr>
+          <w:bCs/>
+          <w:sz w:val="28"/>
+          <w:lang w:val="en-US"/>
+        </w:rPr>
+        <w:t xml:space="preserve"> (Postgres), </w:t>
+      </w:r>
+      <w:proofErr w:type="spellStart"/>
+      <w:r>
+        <w:rPr>
+          <w:bCs/>
+          <w:sz w:val="28"/>
+          <w:lang w:val="en-US"/>
+        </w:rPr>
+        <w:t>SQLAlchemy</w:t>
+      </w:r>
+      <w:proofErr w:type="spellEnd"/>
+      <w:r>
+        <w:rPr>
+          <w:bCs/>
+          <w:sz w:val="28"/>
+          <w:lang w:val="en-US"/>
+        </w:rPr>
+        <w:t xml:space="preserve">, OAuth2 com JWT, </w:t>
+      </w:r>
+      <w:proofErr w:type="spellStart"/>
+      <w:r>
+        <w:rPr>
+          <w:bCs/>
+          <w:sz w:val="28"/>
+          <w:lang w:val="en-US"/>
+        </w:rPr>
+        <w:t>Streamlit</w:t>
+      </w:r>
+      <w:proofErr w:type="spellEnd"/>
+      <w:r>
+        <w:rPr>
+          <w:bCs/>
+          <w:sz w:val="28"/>
+          <w:lang w:val="en-US"/>
         </w:rPr>
         <w:t xml:space="preserve"> </w:t>
       </w:r>
@@ -616,22 +691,60 @@
       <w:pPr>
         <w:spacing w:after="0" w:line="259" w:lineRule="auto"/>
         <w:ind w:left="0" w:firstLine="0"/>
+        <w:rPr>
+          <w:lang w:val="en-US"/>
+        </w:rPr>
       </w:pPr>
       <w:r>
         <w:rPr>
           <w:b/>
           <w:sz w:val="28"/>
-        </w:rPr>
-        <w:t xml:space="preserve"> </w:t>
-      </w:r>
-    </w:p>
-    <w:p>
-      <w:pPr>
-        <w:pStyle w:val="Ttulo1"/>
+          <w:lang w:val="en-US"/>
+        </w:rPr>
+        <w:t xml:space="preserve"> </w:t>
+      </w:r>
+    </w:p>
+    <w:p>
+      <w:pPr>
+        <w:pStyle w:val="Heading1"/>
         <w:ind w:left="65"/>
-      </w:pPr>
-      <w:r>
-        <w:t xml:space="preserve">4. Requisitos Funcionais </w:t>
+        <w:rPr>
+          <w:lang w:val="en-US"/>
+        </w:rPr>
+      </w:pPr>
+      <w:r>
+        <w:rPr>
+          <w:lang w:val="en-US"/>
+        </w:rPr>
+        <w:t xml:space="preserve">4. </w:t>
+      </w:r>
+      <w:proofErr w:type="spellStart"/>
+      <w:r>
+        <w:rPr>
+          <w:lang w:val="en-US"/>
+        </w:rPr>
+        <w:t>Requisitos</w:t>
+      </w:r>
+      <w:proofErr w:type="spellEnd"/>
+      <w:r>
+        <w:rPr>
+          <w:lang w:val="en-US"/>
+        </w:rPr>
+        <w:t xml:space="preserve"> </w:t>
+      </w:r>
+      <w:proofErr w:type="spellStart"/>
+      <w:r>
+        <w:rPr>
+          <w:lang w:val="en-US"/>
+        </w:rPr>
+        <w:t>Funcionais</w:t>
+      </w:r>
+      <w:proofErr w:type="spellEnd"/>
+      <w:r>
+        <w:rPr>
+          <w:lang w:val="en-US"/>
+        </w:rPr>
+        <w:t xml:space="preserve"> </w:t>
       </w:r>
     </w:p>
     <w:p>
@@ -752,21 +865,7 @@
           <w:b/>
           <w:bCs/>
         </w:rPr>
-        <w:t>RF0</w:t>
-      </w:r>
-      <w:r>
-        <w:rPr>
-          <w:b/>
-          <w:bCs/>
-        </w:rPr>
-        <w:t>4</w:t>
-      </w:r>
-      <w:r>
-        <w:rPr>
-          <w:b/>
-          <w:bCs/>
-        </w:rPr>
-        <w:t xml:space="preserve"> — Dashboard de Progresso:</w:t>
+        <w:t>RF04 — Dashboard de Progresso:</w:t>
       </w:r>
       <w:r>
         <w:t xml:space="preserve"> Uma barra visual simples que cresce conforme evidências são validadas.</w:t>
@@ -818,6 +917,7 @@
         <w:rPr>
           <w:rFonts w:hAnsi="Symbol"/>
         </w:rPr>
+        <w:lastRenderedPageBreak/>
         <w:t></w:t>
       </w:r>
       <w:r>
@@ -882,7 +982,7 @@
     </w:p>
     <w:p>
       <w:pPr>
-        <w:pStyle w:val="Ttulo1"/>
+        <w:pStyle w:val="Heading1"/>
         <w:ind w:left="65"/>
       </w:pPr>
       <w:r>
@@ -1030,27 +1130,11 @@
           <w:b/>
           <w:bCs/>
         </w:rPr>
-        <w:t>0</w:t>
+        <w:t>04 — Interface "Zen":</w:t>
       </w:r>
       <w:r>
         <w:rPr>
           <w:rStyle w:val="citation-274"/>
-          <w:b/>
-          <w:bCs/>
-        </w:rPr>
-        <w:t>4</w:t>
-      </w:r>
-      <w:r>
-        <w:rPr>
-          <w:rStyle w:val="citation-274"/>
-          <w:b/>
-          <w:bCs/>
-        </w:rPr>
-        <w:t xml:space="preserve"> — Interface "Zen":</w:t>
-      </w:r>
-      <w:r>
-        <w:rPr>
-          <w:rStyle w:val="citation-274"/>
         </w:rPr>
         <w:t xml:space="preserve"> Cores neutras, sem menus laterais complexos ou notificações pop-up</w:t>
       </w:r>
@@ -1077,23 +1161,7 @@
           <w:b/>
           <w:bCs/>
         </w:rPr>
-        <w:t>0</w:t>
-      </w:r>
-      <w:r>
-        <w:rPr>
-          <w:rStyle w:val="citation-273"/>
-          <w:b/>
-          <w:bCs/>
-        </w:rPr>
-        <w:t>5</w:t>
-      </w:r>
-      <w:r>
-        <w:rPr>
-          <w:rStyle w:val="citation-273"/>
-          <w:b/>
-          <w:bCs/>
-        </w:rPr>
-        <w:t xml:space="preserve"> — Mobile-</w:t>
+        <w:t>05 — Mobile-</w:t>
       </w:r>
       <w:proofErr w:type="spellStart"/>
       <w:r>
@@ -1240,7 +1308,7 @@
     </w:p>
     <w:p>
       <w:pPr>
-        <w:pStyle w:val="Ttulo1"/>
+        <w:pStyle w:val="Heading1"/>
         <w:ind w:left="65"/>
       </w:pPr>
       <w:r>
@@ -1320,7 +1388,7 @@
     </w:p>
     <w:p>
       <w:pPr>
-        <w:pStyle w:val="Ttulo1"/>
+        <w:pStyle w:val="Heading1"/>
         <w:ind w:left="65"/>
       </w:pPr>
       <w:r>
@@ -1469,6 +1537,7 @@
         <w:rPr>
           <w:rFonts w:hAnsi="Symbol"/>
         </w:rPr>
+        <w:lastRenderedPageBreak/>
         <w:t></w:t>
       </w:r>
       <w:r>
@@ -1518,7 +1587,7 @@
     </w:p>
     <w:p>
       <w:pPr>
-        <w:pStyle w:val="Ttulo1"/>
+        <w:pStyle w:val="Heading1"/>
         <w:ind w:left="65"/>
       </w:pPr>
       <w:r>
@@ -1547,16 +1616,7 @@
         <w:ind w:hanging="122"/>
       </w:pPr>
       <w:r>
-        <w:t>&lt;</w:t>
-      </w:r>
-      <w:r>
-        <w:t>Login funcional</w:t>
-      </w:r>
-      <w:r>
-        <w:t>&gt;</w:t>
-      </w:r>
-      <w:r>
-        <w:t xml:space="preserve"> </w:t>
+        <w:t xml:space="preserve">Login funcional </w:t>
       </w:r>
     </w:p>
     <w:p>
@@ -1568,28 +1628,7 @@
         <w:ind w:hanging="122"/>
       </w:pPr>
       <w:r>
-        <w:t>&lt;</w:t>
-      </w:r>
-      <w:r>
-        <w:t>CRUD operacional</w:t>
-      </w:r>
-      <w:r>
-        <w:t>&gt;</w:t>
-      </w:r>
-    </w:p>
-    <w:p>
-      <w:pPr>
-        <w:numPr>
-          <w:ilvl w:val="0"/>
-          <w:numId w:val="2"/>
-        </w:numPr>
-        <w:ind w:hanging="122"/>
-      </w:pPr>
-      <w:r>
-        <w:t>...</w:t>
-      </w:r>
-      <w:r>
-        <w:t xml:space="preserve"> </w:t>
+        <w:t xml:space="preserve">CRUD operacional </w:t>
       </w:r>
     </w:p>
     <w:p>
@@ -1612,7 +1651,7 @@
     </w:p>
     <w:p>
       <w:pPr>
-        <w:pStyle w:val="Ttulo1"/>
+        <w:pStyle w:val="Heading1"/>
         <w:ind w:left="65"/>
       </w:pPr>
       <w:r>
@@ -2014,7 +2053,7 @@
     </w:p>
     <w:p>
       <w:pPr>
-        <w:pStyle w:val="Ttulo1"/>
+        <w:pStyle w:val="Heading1"/>
         <w:ind w:left="65"/>
       </w:pPr>
       <w:r>
@@ -2246,15 +2285,12 @@
     </w:p>
     <w:p>
       <w:pPr>
-        <w:pStyle w:val="Ttulo1"/>
+        <w:pStyle w:val="Heading1"/>
         <w:spacing w:after="0"/>
         <w:ind w:left="65"/>
       </w:pPr>
       <w:r>
-        <w:t xml:space="preserve">12. </w:t>
-      </w:r>
-      <w:r>
-        <w:t xml:space="preserve">Conclusão </w:t>
+        <w:t xml:space="preserve">12. Conclusão </w:t>
       </w:r>
     </w:p>
     <w:p>
@@ -2275,7 +2311,7 @@
 </file>
 
 <file path=word/numbering.xml><?xml version="1.0" encoding="utf-8"?>
-<w:numbering xmlns:wpc="http://schemas.microsoft.com/office/word/2010/wordprocessingCanvas" xmlns:cx="http://schemas.microsoft.com/office/drawing/2014/chartex" xmlns:cx1="http://schemas.microsoft.com/office/drawing/2015/9/8/chartex" xmlns:cx2="http://schemas.microsoft.com/office/drawing/2015/10/21/chartex" xmlns:cx3="http://schemas.microsoft.com/office/drawing/2016/5/9/chartex" xmlns:cx4="http://schemas.microsoft.com/office/drawing/2016/5/10/chartex" xmlns:cx5="http://schemas.microsoft.com/office/drawing/2016/5/11/chartex" xmlns:cx6="http://schemas.microsoft.com/office/drawing/2016/5/12/chartex" xmlns:cx7="http://schemas.microsoft.com/office/drawing/2016/5/13/chartex" xmlns:cx8="http://schemas.microsoft.com/office/drawing/2016/5/14/chartex" xmlns:mc="http://schemas.openxmlformats.org/markup-compatibility/2006" xmlns:aink="http://schemas.microsoft.com/office/drawing/2016/ink" xmlns:am3d="http://schemas.microsoft.com/office/drawing/2017/model3d" xmlns:o="urn:schemas-microsoft-com:office:office" xmlns:r="http://schemas.openxmlformats.org/officeDocument/2006/relationships" xmlns:m="http://schemas.openxmlformats.org/officeDocument/2006/math" xmlns:v="urn:schemas-microsoft-com:vml" xmlns:wp14="http://schemas.microsoft.com/office/word/2010/wordprocessingDrawing" xmlns:wp="http://schemas.openxmlformats.org/drawingml/2006/wordprocessingDrawing" xmlns:w10="urn:schemas-microsoft-com:office:word" xmlns:w="http://schemas.openxmlformats.org/wordprocessingml/2006/main" xmlns:w14="http://schemas.microsoft.com/office/word/2010/wordml" xmlns:w15="http://schemas.microsoft.com/office/word/2012/wordml" xmlns:w16cex="http://schemas.microsoft.com/office/word/2018/wordml/cex" xmlns:w16cid="http://schemas.microsoft.com/office/word/2016/wordml/cid" xmlns:w16="http://schemas.microsoft.com/office/word/2018/wordml" xmlns:w16sdtdh="http://schemas.microsoft.com/office/word/2020/wordml/sdtdatahash" xmlns:w16se="http://schemas.microsoft.com/office/word/2015/wordml/symex" xmlns:wpg="http://schemas.microsoft.com/office/word/2010/wordprocessingGroup" xmlns:wpi="http://schemas.microsoft.com/office/word/2010/wordprocessingInk" xmlns:wne="http://schemas.microsoft.com/office/word/2006/wordml" xmlns:wps="http://schemas.microsoft.com/office/word/2010/wordprocessingShape" mc:Ignorable="w14 w15 w16se w16cid w16 w16cex w16sdtdh wp14">
+<w:numbering xmlns:wpc="http://schemas.microsoft.com/office/word/2010/wordprocessingCanvas" xmlns:cx="http://schemas.microsoft.com/office/drawing/2014/chartex" xmlns:cx1="http://schemas.microsoft.com/office/drawing/2015/9/8/chartex" xmlns:cx2="http://schemas.microsoft.com/office/drawing/2015/10/21/chartex" xmlns:cx3="http://schemas.microsoft.com/office/drawing/2016/5/9/chartex" xmlns:cx4="http://schemas.microsoft.com/office/drawing/2016/5/10/chartex" xmlns:cx5="http://schemas.microsoft.com/office/drawing/2016/5/11/chartex" xmlns:cx6="http://schemas.microsoft.com/office/drawing/2016/5/12/chartex" xmlns:cx7="http://schemas.microsoft.com/office/drawing/2016/5/13/chartex" xmlns:cx8="http://schemas.microsoft.com/office/drawing/2016/5/14/chartex" xmlns:mc="http://schemas.openxmlformats.org/markup-compatibility/2006" xmlns:aink="http://schemas.microsoft.com/office/drawing/2016/ink" xmlns:am3d="http://schemas.microsoft.com/office/drawing/2017/model3d" xmlns:o="urn:schemas-microsoft-com:office:office" xmlns:oel="http://schemas.microsoft.com/office/2019/extlst" xmlns:r="http://schemas.openxmlformats.org/officeDocument/2006/relationships" xmlns:m="http://schemas.openxmlformats.org/officeDocument/2006/math" xmlns:v="urn:schemas-microsoft-com:vml" xmlns:wp14="http://schemas.microsoft.com/office/word/2010/wordprocessingDrawing" xmlns:wp="http://schemas.openxmlformats.org/drawingml/2006/wordprocessingDrawing" xmlns:w10="urn:schemas-microsoft-com:office:word" xmlns:w="http://schemas.openxmlformats.org/wordprocessingml/2006/main" xmlns:w14="http://schemas.microsoft.com/office/word/2010/wordml" xmlns:w15="http://schemas.microsoft.com/office/word/2012/wordml" xmlns:w16cex="http://schemas.microsoft.com/office/word/2018/wordml/cex" xmlns:w16cid="http://schemas.microsoft.com/office/word/2016/wordml/cid" xmlns:w16="http://schemas.microsoft.com/office/word/2018/wordml" xmlns:w16du="http://schemas.microsoft.com/office/word/2023/wordml/word16du" xmlns:w16sdtdh="http://schemas.microsoft.com/office/word/2020/wordml/sdtdatahash" xmlns:w16sdtfl="http://schemas.microsoft.com/office/word/2024/wordml/sdtformatlock" xmlns:w16se="http://schemas.microsoft.com/office/word/2015/wordml/symex" xmlns:wpg="http://schemas.microsoft.com/office/word/2010/wordprocessingGroup" xmlns:wpi="http://schemas.microsoft.com/office/word/2010/wordprocessingInk" xmlns:wne="http://schemas.microsoft.com/office/word/2006/wordml" xmlns:wps="http://schemas.microsoft.com/office/word/2010/wordprocessingShape" mc:Ignorable="w14 w15 w16se w16cid w16 w16cex w16sdtdh w16sdtfl w16du wp14">
   <w:abstractNum w:abstractNumId="0" w15:restartNumberingAfterBreak="0">
     <w:nsid w:val="0C4F534F"/>
     <w:multiLevelType w:val="hybridMultilevel"/>
@@ -3025,23 +3061,23 @@
       </w:rPr>
     </w:lvl>
   </w:abstractNum>
-  <w:num w:numId="1">
+  <w:num w:numId="1" w16cid:durableId="2015103558">
     <w:abstractNumId w:val="1"/>
   </w:num>
-  <w:num w:numId="2">
+  <w:num w:numId="2" w16cid:durableId="2122719621">
     <w:abstractNumId w:val="3"/>
   </w:num>
-  <w:num w:numId="3">
+  <w:num w:numId="3" w16cid:durableId="111438057">
     <w:abstractNumId w:val="2"/>
   </w:num>
-  <w:num w:numId="4">
+  <w:num w:numId="4" w16cid:durableId="765003278">
     <w:abstractNumId w:val="0"/>
   </w:num>
 </w:numbering>
 </file>
 
 <file path=word/styles.xml><?xml version="1.0" encoding="utf-8"?>
-<w:styles xmlns:mc="http://schemas.openxmlformats.org/markup-compatibility/2006" xmlns:r="http://schemas.openxmlformats.org/officeDocument/2006/relationships" xmlns:w="http://schemas.openxmlformats.org/wordprocessingml/2006/main" xmlns:w14="http://schemas.microsoft.com/office/word/2010/wordml" xmlns:w15="http://schemas.microsoft.com/office/word/2012/wordml" xmlns:w16cex="http://schemas.microsoft.com/office/word/2018/wordml/cex" xmlns:w16cid="http://schemas.microsoft.com/office/word/2016/wordml/cid" xmlns:w16="http://schemas.microsoft.com/office/word/2018/wordml" xmlns:w16sdtdh="http://schemas.microsoft.com/office/word/2020/wordml/sdtdatahash" xmlns:w16se="http://schemas.microsoft.com/office/word/2015/wordml/symex" mc:Ignorable="w14 w15 w16se w16cid w16 w16cex w16sdtdh">
+<w:styles xmlns:mc="http://schemas.openxmlformats.org/markup-compatibility/2006" xmlns:r="http://schemas.openxmlformats.org/officeDocument/2006/relationships" xmlns:w="http://schemas.openxmlformats.org/wordprocessingml/2006/main" xmlns:w14="http://schemas.microsoft.com/office/word/2010/wordml" xmlns:w15="http://schemas.microsoft.com/office/word/2012/wordml" xmlns:w16cex="http://schemas.microsoft.com/office/word/2018/wordml/cex" xmlns:w16cid="http://schemas.microsoft.com/office/word/2016/wordml/cid" xmlns:w16="http://schemas.microsoft.com/office/word/2018/wordml" xmlns:w16du="http://schemas.microsoft.com/office/word/2023/wordml/word16du" xmlns:w16sdtdh="http://schemas.microsoft.com/office/word/2020/wordml/sdtdatahash" xmlns:w16sdtfl="http://schemas.microsoft.com/office/word/2024/wordml/sdtformatlock" xmlns:w16se="http://schemas.microsoft.com/office/word/2015/wordml/symex" mc:Ignorable="w14 w15 w16se w16cid w16 w16cex w16sdtdh w16sdtfl w16du">
   <w:docDefaults>
     <w:rPrDefault>
       <w:rPr>
@@ -3448,10 +3484,10 @@
       <w:sz w:val="20"/>
     </w:rPr>
   </w:style>
-  <w:style w:type="paragraph" w:styleId="Ttulo1">
+  <w:style w:type="paragraph" w:styleId="Heading1">
     <w:name w:val="heading 1"/>
     <w:next w:val="Normal"/>
-    <w:link w:val="Ttulo1Char"/>
+    <w:link w:val="Heading1Char"/>
     <w:uiPriority w:val="9"/>
     <w:qFormat/>
     <w:pPr>
@@ -3468,13 +3504,13 @@
       <w:sz w:val="28"/>
     </w:rPr>
   </w:style>
-  <w:style w:type="character" w:default="1" w:styleId="Fontepargpadro">
+  <w:style w:type="character" w:default="1" w:styleId="DefaultParagraphFont">
     <w:name w:val="Default Paragraph Font"/>
     <w:uiPriority w:val="1"/>
     <w:semiHidden/>
     <w:unhideWhenUsed/>
   </w:style>
-  <w:style w:type="table" w:default="1" w:styleId="Tabelanormal">
+  <w:style w:type="table" w:default="1" w:styleId="TableNormal">
     <w:name w:val="Normal Table"/>
     <w:uiPriority w:val="99"/>
     <w:semiHidden/>
@@ -3489,15 +3525,15 @@
       </w:tblCellMar>
     </w:tblPr>
   </w:style>
-  <w:style w:type="numbering" w:default="1" w:styleId="Semlista">
+  <w:style w:type="numbering" w:default="1" w:styleId="NoList">
     <w:name w:val="No List"/>
     <w:uiPriority w:val="99"/>
     <w:semiHidden/>
     <w:unhideWhenUsed/>
   </w:style>
-  <w:style w:type="character" w:customStyle="1" w:styleId="Ttulo1Char">
-    <w:name w:val="Título 1 Char"/>
-    <w:link w:val="Ttulo1"/>
+  <w:style w:type="character" w:customStyle="1" w:styleId="Heading1Char">
+    <w:name w:val="Heading 1 Char"/>
+    <w:link w:val="Heading1"/>
     <w:rPr>
       <w:rFonts w:ascii="Arial" w:eastAsia="Arial" w:hAnsi="Arial" w:cs="Arial"/>
       <w:b/>
@@ -3521,7 +3557,7 @@
   </w:style>
   <w:style w:type="character" w:customStyle="1" w:styleId="citation-109">
     <w:name w:val="citation-109"/>
-    <w:basedOn w:val="Fontepargpadro"/>
+    <w:basedOn w:val="DefaultParagraphFont"/>
     <w:rsid w:val="00292F76"/>
   </w:style>
   <w:style w:type="paragraph" w:styleId="NormalWeb">
@@ -3543,97 +3579,97 @@
   </w:style>
   <w:style w:type="character" w:customStyle="1" w:styleId="citation-100">
     <w:name w:val="citation-100"/>
-    <w:basedOn w:val="Fontepargpadro"/>
+    <w:basedOn w:val="DefaultParagraphFont"/>
     <w:rsid w:val="00292F76"/>
   </w:style>
   <w:style w:type="character" w:customStyle="1" w:styleId="citation-99">
     <w:name w:val="citation-99"/>
-    <w:basedOn w:val="Fontepargpadro"/>
+    <w:basedOn w:val="DefaultParagraphFont"/>
     <w:rsid w:val="00292F76"/>
   </w:style>
   <w:style w:type="character" w:customStyle="1" w:styleId="citation-98">
     <w:name w:val="citation-98"/>
-    <w:basedOn w:val="Fontepargpadro"/>
+    <w:basedOn w:val="DefaultParagraphFont"/>
     <w:rsid w:val="00292F76"/>
   </w:style>
   <w:style w:type="character" w:customStyle="1" w:styleId="citation-97">
     <w:name w:val="citation-97"/>
-    <w:basedOn w:val="Fontepargpadro"/>
+    <w:basedOn w:val="DefaultParagraphFont"/>
     <w:rsid w:val="00292F76"/>
   </w:style>
   <w:style w:type="character" w:customStyle="1" w:styleId="citation-95">
     <w:name w:val="citation-95"/>
-    <w:basedOn w:val="Fontepargpadro"/>
+    <w:basedOn w:val="DefaultParagraphFont"/>
     <w:rsid w:val="00292F76"/>
   </w:style>
   <w:style w:type="character" w:customStyle="1" w:styleId="citation-94">
     <w:name w:val="citation-94"/>
-    <w:basedOn w:val="Fontepargpadro"/>
+    <w:basedOn w:val="DefaultParagraphFont"/>
     <w:rsid w:val="00292F76"/>
   </w:style>
   <w:style w:type="character" w:customStyle="1" w:styleId="citation-93">
     <w:name w:val="citation-93"/>
-    <w:basedOn w:val="Fontepargpadro"/>
+    <w:basedOn w:val="DefaultParagraphFont"/>
     <w:rsid w:val="00292F76"/>
   </w:style>
   <w:style w:type="character" w:customStyle="1" w:styleId="citation-89">
     <w:name w:val="citation-89"/>
-    <w:basedOn w:val="Fontepargpadro"/>
+    <w:basedOn w:val="DefaultParagraphFont"/>
     <w:rsid w:val="00292F76"/>
   </w:style>
   <w:style w:type="character" w:customStyle="1" w:styleId="citation-88">
     <w:name w:val="citation-88"/>
-    <w:basedOn w:val="Fontepargpadro"/>
+    <w:basedOn w:val="DefaultParagraphFont"/>
     <w:rsid w:val="00292F76"/>
   </w:style>
   <w:style w:type="character" w:customStyle="1" w:styleId="citation-86">
     <w:name w:val="citation-86"/>
-    <w:basedOn w:val="Fontepargpadro"/>
+    <w:basedOn w:val="DefaultParagraphFont"/>
     <w:rsid w:val="00292F76"/>
   </w:style>
   <w:style w:type="character" w:customStyle="1" w:styleId="citation-85">
     <w:name w:val="citation-85"/>
-    <w:basedOn w:val="Fontepargpadro"/>
+    <w:basedOn w:val="DefaultParagraphFont"/>
     <w:rsid w:val="00292F76"/>
   </w:style>
   <w:style w:type="character" w:customStyle="1" w:styleId="citation-84">
     <w:name w:val="citation-84"/>
-    <w:basedOn w:val="Fontepargpadro"/>
+    <w:basedOn w:val="DefaultParagraphFont"/>
     <w:rsid w:val="00292F76"/>
   </w:style>
   <w:style w:type="character" w:customStyle="1" w:styleId="citation-274">
     <w:name w:val="citation-274"/>
-    <w:basedOn w:val="Fontepargpadro"/>
+    <w:basedOn w:val="DefaultParagraphFont"/>
     <w:rsid w:val="004C175B"/>
   </w:style>
   <w:style w:type="character" w:customStyle="1" w:styleId="citation-273">
     <w:name w:val="citation-273"/>
-    <w:basedOn w:val="Fontepargpadro"/>
+    <w:basedOn w:val="DefaultParagraphFont"/>
     <w:rsid w:val="004C175B"/>
   </w:style>
   <w:style w:type="character" w:customStyle="1" w:styleId="citation-263">
     <w:name w:val="citation-263"/>
-    <w:basedOn w:val="Fontepargpadro"/>
+    <w:basedOn w:val="DefaultParagraphFont"/>
     <w:rsid w:val="004C175B"/>
   </w:style>
   <w:style w:type="character" w:customStyle="1" w:styleId="citation-261">
     <w:name w:val="citation-261"/>
-    <w:basedOn w:val="Fontepargpadro"/>
+    <w:basedOn w:val="DefaultParagraphFont"/>
     <w:rsid w:val="00352C34"/>
   </w:style>
   <w:style w:type="character" w:customStyle="1" w:styleId="citation-259">
     <w:name w:val="citation-259"/>
-    <w:basedOn w:val="Fontepargpadro"/>
+    <w:basedOn w:val="DefaultParagraphFont"/>
     <w:rsid w:val="00352C34"/>
   </w:style>
   <w:style w:type="character" w:customStyle="1" w:styleId="citation-258">
     <w:name w:val="citation-258"/>
-    <w:basedOn w:val="Fontepargpadro"/>
+    <w:basedOn w:val="DefaultParagraphFont"/>
     <w:rsid w:val="00352C34"/>
   </w:style>
   <w:style w:type="character" w:customStyle="1" w:styleId="citation-257">
     <w:name w:val="citation-257"/>
-    <w:basedOn w:val="Fontepargpadro"/>
+    <w:basedOn w:val="DefaultParagraphFont"/>
     <w:rsid w:val="00352C34"/>
   </w:style>
 </w:styles>

</xml_diff>